<commit_message>
Update report.docx with latest student-finalised version
Replaces the stale report.docx with the newer version (previously saved
locally as SignalScope_ProjectB.docx). report.pdf is not regenerated in
this commit and is now stale relative to the new docx.
</commit_message>
<xml_diff>
--- a/report/report.docx
+++ b/report/report.docx
@@ -2,6 +2,62 @@
 <file path=word/document.xml><?xml version="1.0" encoding="utf-8"?>
 <w:document xmlns:wpc="http://schemas.microsoft.com/office/word/2010/wordprocessingCanvas" xmlns:mc="http://schemas.openxmlformats.org/markup-compatibility/2006" xmlns:o="urn:schemas-microsoft-com:office:office" xmlns:r="http://schemas.openxmlformats.org/officeDocument/2006/relationships" xmlns:m="http://schemas.openxmlformats.org/officeDocument/2006/math" xmlns:v="urn:schemas-microsoft-com:vml" xmlns:wp14="http://schemas.microsoft.com/office/word/2010/wordprocessingDrawing" xmlns:wp="http://schemas.openxmlformats.org/drawingml/2006/wordprocessingDrawing" xmlns:w10="urn:schemas-microsoft-com:office:word" xmlns:w="http://schemas.openxmlformats.org/wordprocessingml/2006/main" xmlns:w14="http://schemas.microsoft.com/office/word/2010/wordml" xmlns:w15="http://schemas.microsoft.com/office/word/2012/wordml" xmlns:wpg="http://schemas.microsoft.com/office/word/2010/wordprocessingGroup" xmlns:wpi="http://schemas.microsoft.com/office/word/2010/wordprocessingInk" xmlns:wne="http://schemas.microsoft.com/office/word/2006/wordml" xmlns:wps="http://schemas.microsoft.com/office/word/2010/wordprocessingShape" xmlns:cx="http://schemas.microsoft.com/office/drawing/2014/chartex" xmlns:cx1="http://schemas.microsoft.com/office/drawing/2015/9/8/chartex" xmlns:cx2="http://schemas.microsoft.com/office/drawing/2015/10/21/chartex" xmlns:cx3="http://schemas.microsoft.com/office/drawing/2016/5/9/chartex" xmlns:cx4="http://schemas.microsoft.com/office/drawing/2016/5/10/chartex" xmlns:cx5="http://schemas.microsoft.com/office/drawing/2016/5/11/chartex" xmlns:cx6="http://schemas.microsoft.com/office/drawing/2016/5/12/chartex" xmlns:cx7="http://schemas.microsoft.com/office/drawing/2016/5/13/chartex" xmlns:cx8="http://schemas.microsoft.com/office/drawing/2016/5/14/chartex" xmlns:aink="http://schemas.microsoft.com/office/drawing/2016/ink" xmlns:am3d="http://schemas.microsoft.com/office/drawing/2017/model3d" xmlns:w16cex="http://schemas.microsoft.com/office/word/2018/wordml/cex" xmlns:w16cid="http://schemas.microsoft.com/office/word/2016/wordml/cid" xmlns:w16="http://schemas.microsoft.com/office/word/2018/wordml" xmlns:w16sdtdh="http://schemas.microsoft.com/office/word/2020/wordml/sdtdatahash" xmlns:w16se="http://schemas.microsoft.com/office/word/2015/wordml/symex" mc:Ignorable="w14 w15 wp14">
   <w:body>
+    <w:p>
+      <w:pPr>
+        <w:spacing w:after="0" w:before="0" w:line="240" w:lineRule="auto"/>
+        <w:ind w:left="0" w:right="0"/>
+      </w:pPr>
+      <w:r>
+        <w:drawing>
+          <wp:inline distT="0" distB="0" distL="0" distR="0">
+            <wp:extent cx="7562850" cy="10696575"/>
+            <wp:effectExtent t="0" r="0" b="0" l="0"/>
+            <wp:docPr id="1" name="" descr="" title=""/>
+            <wp:cNvGraphicFramePr>
+              <a:graphicFrameLocks xmlns:a="http://schemas.openxmlformats.org/drawingml/2006/main" noChangeAspect="1"/>
+            </wp:cNvGraphicFramePr>
+            <a:graphic xmlns:a="http://schemas.openxmlformats.org/drawingml/2006/main">
+              <a:graphicData uri="http://schemas.openxmlformats.org/drawingml/2006/picture">
+                <pic:pic xmlns:pic="http://schemas.openxmlformats.org/drawingml/2006/picture">
+                  <pic:nvPicPr>
+                    <pic:cNvPr id="0" name="" descr=""/>
+                    <pic:cNvPicPr>
+                      <a:picLocks noChangeAspect="1" noChangeArrowheads="1"/>
+                    </pic:cNvPicPr>
+                  </pic:nvPicPr>
+                  <pic:blipFill>
+                    <a:blip r:embed="rId9" cstate="none"/>
+                    <a:srcRect/>
+                    <a:stretch>
+                      <a:fillRect/>
+                    </a:stretch>
+                  </pic:blipFill>
+                  <pic:spPr bwMode="auto">
+                    <a:xfrm>
+                      <a:off x="0" y="0"/>
+                      <a:ext cx="7562850" cy="10696575"/>
+                    </a:xfrm>
+                    <a:prstGeom prst="rect">
+                      <a:avLst/>
+                    </a:prstGeom>
+                  </pic:spPr>
+                </pic:pic>
+              </a:graphicData>
+            </a:graphic>
+          </wp:inline>
+        </w:drawing>
+      </w:r>
+    </w:p>
+    <w:p>
+      <w:pPr>
+        <w:sectPr>
+          <w:pgSz w:w="11906" w:h="16838" w:orient="portrait"/>
+          <w:pgMar w:top="0" w:right="0" w:bottom="0" w:left="0" w:header="0" w:footer="0" w:gutter="0"/>
+          <w:pgNumType/>
+          <w:docGrid w:linePitch="360"/>
+        </w:sectPr>
+      </w:pPr>
+    </w:p>
     <w:p>
       <w:pPr>
         <w:spacing w:after="30"/>
@@ -10215,7 +10271,7 @@
                     </pic:cNvPicPr>
                   </pic:nvPicPr>
                   <pic:blipFill>
-                    <a:blip r:embed="rId9" cstate="none"/>
+                    <a:blip r:embed="rId10" cstate="none"/>
                     <a:srcRect/>
                     <a:stretch>
                       <a:fillRect/>
@@ -10263,69 +10319,6 @@
         <w:drawing>
           <wp:inline distT="0" distB="0" distL="0" distR="0">
             <wp:extent cx="4572000" cy="2044361"/>
-            <wp:effectExtent t="0" r="0" b="0" l="0"/>
-            <wp:docPr id="1" name="" descr="" title=""/>
-            <wp:cNvGraphicFramePr>
-              <a:graphicFrameLocks xmlns:a="http://schemas.openxmlformats.org/drawingml/2006/main" noChangeAspect="1"/>
-            </wp:cNvGraphicFramePr>
-            <a:graphic xmlns:a="http://schemas.openxmlformats.org/drawingml/2006/main">
-              <a:graphicData uri="http://schemas.openxmlformats.org/drawingml/2006/picture">
-                <pic:pic xmlns:pic="http://schemas.openxmlformats.org/drawingml/2006/picture">
-                  <pic:nvPicPr>
-                    <pic:cNvPr id="0" name="" descr=""/>
-                    <pic:cNvPicPr>
-                      <a:picLocks noChangeAspect="1" noChangeArrowheads="1"/>
-                    </pic:cNvPicPr>
-                  </pic:nvPicPr>
-                  <pic:blipFill>
-                    <a:blip r:embed="rId10" cstate="none"/>
-                    <a:srcRect/>
-                    <a:stretch>
-                      <a:fillRect/>
-                    </a:stretch>
-                  </pic:blipFill>
-                  <pic:spPr bwMode="auto">
-                    <a:xfrm>
-                      <a:off x="0" y="0"/>
-                      <a:ext cx="4572000" cy="2044361"/>
-                    </a:xfrm>
-                    <a:prstGeom prst="rect">
-                      <a:avLst/>
-                    </a:prstGeom>
-                  </pic:spPr>
-                </pic:pic>
-              </a:graphicData>
-            </a:graphic>
-          </wp:inline>
-        </w:drawing>
-      </w:r>
-    </w:p>
-    <w:p>
-      <w:pPr>
-        <w:spacing w:after="220" w:before="40"/>
-        <w:jc w:val="left"/>
-      </w:pPr>
-      <w:r>
-        <w:rPr>
-          <w:rFonts w:ascii="Calibri" w:cs="Calibri" w:eastAsia="Calibri" w:hAnsi="Calibri"/>
-          <w:i/>
-          <w:iCs/>
-          <w:color w:val="44506B"/>
-          <w:sz w:val="17"/>
-          <w:szCs w:val="17"/>
-        </w:rPr>
-        <w:t xml:space="preserve">Figure C2. Live out-of-sample drawdowns for the minimum-variance funds.</w:t>
-      </w:r>
-    </w:p>
-    <w:p>
-      <w:pPr>
-        <w:spacing w:after="60" w:before="120"/>
-        <w:jc w:val="center"/>
-      </w:pPr>
-      <w:r>
-        <w:drawing>
-          <wp:inline distT="0" distB="0" distL="0" distR="0">
-            <wp:extent cx="4381500" cy="4056075"/>
             <wp:effectExtent t="0" r="0" b="0" l="0"/>
             <wp:docPr id="1" name="" descr="" title=""/>
             <wp:cNvGraphicFramePr>
@@ -10350,7 +10343,7 @@
                   <pic:spPr bwMode="auto">
                     <a:xfrm>
                       <a:off x="0" y="0"/>
-                      <a:ext cx="4381500" cy="4056075"/>
+                      <a:ext cx="4572000" cy="2044361"/>
                     </a:xfrm>
                     <a:prstGeom prst="rect">
                       <a:avLst/>
@@ -10377,7 +10370,7 @@
           <w:sz w:val="17"/>
           <w:szCs w:val="17"/>
         </w:rPr>
-        <w:t xml:space="preserve">Figure C3. Monthly combined-fund target weights. The eight largest average holdings are shown separately; remaining positions are grouped as Other.</w:t>
+        <w:t xml:space="preserve">Figure C2. Live out-of-sample drawdowns for the minimum-variance funds.</w:t>
       </w:r>
     </w:p>
     <w:p>
@@ -10388,7 +10381,7 @@
       <w:r>
         <w:drawing>
           <wp:inline distT="0" distB="0" distL="0" distR="0">
-            <wp:extent cx="4381500" cy="4434177"/>
+            <wp:extent cx="4381500" cy="4056075"/>
             <wp:effectExtent t="0" r="0" b="0" l="0"/>
             <wp:docPr id="1" name="" descr="" title=""/>
             <wp:cNvGraphicFramePr>
@@ -10413,7 +10406,7 @@
                   <pic:spPr bwMode="auto">
                     <a:xfrm>
                       <a:off x="0" y="0"/>
-                      <a:ext cx="4381500" cy="4434177"/>
+                      <a:ext cx="4381500" cy="4056075"/>
                     </a:xfrm>
                     <a:prstGeom prst="rect">
                       <a:avLst/>
@@ -10440,7 +10433,7 @@
           <w:sz w:val="17"/>
           <w:szCs w:val="17"/>
         </w:rPr>
-        <w:t xml:space="preserve">Figure C4. Finance-augmented VADER sector sentiment, equal-weighted across tickers, no-news ticker-days set to neutral; 21-trading-day mean shown for legibility.</w:t>
+        <w:t xml:space="preserve">Figure C3. Monthly combined-fund target weights. The eight largest average holdings are shown separately; remaining positions are grouped as Other.</w:t>
       </w:r>
     </w:p>
     <w:p>
@@ -10451,7 +10444,7 @@
       <w:r>
         <w:drawing>
           <wp:inline distT="0" distB="0" distL="0" distR="0">
-            <wp:extent cx="4572000" cy="2964784"/>
+            <wp:extent cx="4381500" cy="4434177"/>
             <wp:effectExtent t="0" r="0" b="0" l="0"/>
             <wp:docPr id="1" name="" descr="" title=""/>
             <wp:cNvGraphicFramePr>
@@ -10476,7 +10469,7 @@
                   <pic:spPr bwMode="auto">
                     <a:xfrm>
                       <a:off x="0" y="0"/>
-                      <a:ext cx="4572000" cy="2964784"/>
+                      <a:ext cx="4381500" cy="4434177"/>
                     </a:xfrm>
                     <a:prstGeom prst="rect">
                       <a:avLst/>
@@ -10503,7 +10496,7 @@
           <w:sz w:val="17"/>
           <w:szCs w:val="17"/>
         </w:rPr>
-        <w:t xml:space="preserve">Figure C5. Growth and drawdown before and after the reliability-gated sentiment tilt.</w:t>
+        <w:t xml:space="preserve">Figure C4. Finance-augmented VADER sector sentiment, equal-weighted across tickers, no-news ticker-days set to neutral; 21-trading-day mean shown for legibility.</w:t>
       </w:r>
     </w:p>
     <w:p>
@@ -10514,7 +10507,7 @@
       <w:r>
         <w:drawing>
           <wp:inline distT="0" distB="0" distL="0" distR="0">
-            <wp:extent cx="4572000" cy="2611133"/>
+            <wp:extent cx="4572000" cy="2964784"/>
             <wp:effectExtent t="0" r="0" b="0" l="0"/>
             <wp:docPr id="1" name="" descr="" title=""/>
             <wp:cNvGraphicFramePr>
@@ -10539,7 +10532,7 @@
                   <pic:spPr bwMode="auto">
                     <a:xfrm>
                       <a:off x="0" y="0"/>
-                      <a:ext cx="4572000" cy="2611133"/>
+                      <a:ext cx="4572000" cy="2964784"/>
                     </a:xfrm>
                     <a:prstGeom prst="rect">
                       <a:avLst/>
@@ -10566,7 +10559,7 @@
           <w:sz w:val="17"/>
           <w:szCs w:val="17"/>
         </w:rPr>
-        <w:t xml:space="preserve">Figure C6. Annualised out-of-sample return versus annualised volatility across funds and methods after transaction costs; point size increases with the Sharpe ratio.</w:t>
+        <w:t xml:space="preserve">Figure C5. Growth and drawdown before and after the reliability-gated sentiment tilt.</w:t>
       </w:r>
     </w:p>
     <w:p>
@@ -10577,7 +10570,7 @@
       <w:r>
         <w:drawing>
           <wp:inline distT="0" distB="0" distL="0" distR="0">
-            <wp:extent cx="4572000" cy="2535583"/>
+            <wp:extent cx="4572000" cy="2611133"/>
             <wp:effectExtent t="0" r="0" b="0" l="0"/>
             <wp:docPr id="1" name="" descr="" title=""/>
             <wp:cNvGraphicFramePr>
@@ -10602,6 +10595,69 @@
                   <pic:spPr bwMode="auto">
                     <a:xfrm>
                       <a:off x="0" y="0"/>
+                      <a:ext cx="4572000" cy="2611133"/>
+                    </a:xfrm>
+                    <a:prstGeom prst="rect">
+                      <a:avLst/>
+                    </a:prstGeom>
+                  </pic:spPr>
+                </pic:pic>
+              </a:graphicData>
+            </a:graphic>
+          </wp:inline>
+        </w:drawing>
+      </w:r>
+    </w:p>
+    <w:p>
+      <w:pPr>
+        <w:spacing w:after="220" w:before="40"/>
+        <w:jc w:val="left"/>
+      </w:pPr>
+      <w:r>
+        <w:rPr>
+          <w:rFonts w:ascii="Calibri" w:cs="Calibri" w:eastAsia="Calibri" w:hAnsi="Calibri"/>
+          <w:i/>
+          <w:iCs/>
+          <w:color w:val="44506B"/>
+          <w:sz w:val="17"/>
+          <w:szCs w:val="17"/>
+        </w:rPr>
+        <w:t xml:space="preserve">Figure C6. Annualised out-of-sample return versus annualised volatility across funds and methods after transaction costs; point size increases with the Sharpe ratio.</w:t>
+      </w:r>
+    </w:p>
+    <w:p>
+      <w:pPr>
+        <w:spacing w:after="60" w:before="120"/>
+        <w:jc w:val="center"/>
+      </w:pPr>
+      <w:r>
+        <w:drawing>
+          <wp:inline distT="0" distB="0" distL="0" distR="0">
+            <wp:extent cx="4572000" cy="2535583"/>
+            <wp:effectExtent t="0" r="0" b="0" l="0"/>
+            <wp:docPr id="1" name="" descr="" title=""/>
+            <wp:cNvGraphicFramePr>
+              <a:graphicFrameLocks xmlns:a="http://schemas.openxmlformats.org/drawingml/2006/main" noChangeAspect="1"/>
+            </wp:cNvGraphicFramePr>
+            <a:graphic xmlns:a="http://schemas.openxmlformats.org/drawingml/2006/main">
+              <a:graphicData uri="http://schemas.openxmlformats.org/drawingml/2006/picture">
+                <pic:pic xmlns:pic="http://schemas.openxmlformats.org/drawingml/2006/picture">
+                  <pic:nvPicPr>
+                    <pic:cNvPr id="0" name="" descr=""/>
+                    <pic:cNvPicPr>
+                      <a:picLocks noChangeAspect="1" noChangeArrowheads="1"/>
+                    </pic:cNvPicPr>
+                  </pic:nvPicPr>
+                  <pic:blipFill>
+                    <a:blip r:embed="rId16" cstate="none"/>
+                    <a:srcRect/>
+                    <a:stretch>
+                      <a:fillRect/>
+                    </a:stretch>
+                  </pic:blipFill>
+                  <pic:spPr bwMode="auto">
+                    <a:xfrm>
+                      <a:off x="0" y="0"/>
                       <a:ext cx="4572000" cy="2535583"/>
                     </a:xfrm>
                     <a:prstGeom prst="rect">
@@ -12253,7 +12309,7 @@
       <w:footerReference w:type="default" r:id="rId8"/>
       <w:pgSz w:w="11906" w:h="16838" w:orient="portrait"/>
       <w:pgMar w:top="1080" w:right="1080" w:bottom="1080" w:left="1080" w:header="708" w:footer="708" w:gutter="0"/>
-      <w:pgNumType/>
+      <w:pgNumType w:start="1"/>
       <w:docGrid w:linePitch="360"/>
     </w:sectPr>
   </w:body>

</xml_diff>